<commit_message>
New chaps from vallier and karakasis.
</commit_message>
<xml_diff>
--- a/chapters/vallier.docx
+++ b/chapters/vallier.docx
@@ -99,9 +99,7 @@
         <w:ind w:firstLine="720"/>
       </w:pPr>
       <w:r>
-        <w:t xml:space="preserve">Gaus’s approach to justifying the state is distinctive among the theorists discussed in this volume. Unlike social contract theorists who begin with the state and ask what justifies it, Gaus begins with moral relations among free and equal persons and asks what role the state plays in sustaining them. The state is justified insofar as it helps maintain a publicly justified social morality. But social morality has priority over political authority, and every use of state coercion must be independently justified. Unlike A. John Simmons, who argues that no existing state has legitimate political authority, Gaus does not conclude that the failure of consent-based </w:t>
-      </w:r>
-      <w:r>
+        <w:t xml:space="preserve">Gaus’s approach to justifying the state is distinctive among many of the theorists discussed in this volume. Unlike social contract theorists who begin with the state and ask what justifies it, Gaus begins with moral relations among free and equal persons and asks what role the state plays in sustaining them. The state is justified insofar as it helps maintain a publicly justified social morality. But social morality has priority over political authority, and every use of state coercion must be independently justified. Unlike A. John Simmons, who argues that no existing state has legitimate political authority, Gaus does not conclude that the failure of consent-based </w:t>
         <w:lastRenderedPageBreak/>
         <w:t>justifications leaves the state unjustified. Unlike James Buchanan, who grounds the state in a constitutional bargain among self-interested agents, Gaus treats citizens as moral agents with diverse evaluative commitments. And unlike John Rawls, he does not derive the state’s authority from principles chosen behind a veil of ignorance. The result is a theory of the state that is neither anarchist nor statist, but one that yields what Gaus calls a “classical tilt” toward limited government.</w:t>
       </w:r>
@@ -157,8 +155,6 @@
       </w:r>
       <w:r>
         <w:t xml:space="preserve"> Hobbesian political philosophy claims that we can establish social cooperation through instrumental rationality alone. Reflecting solely on our goals and the best means to reach them, we will agree on the terms of social life. Gaus dissented. </w:t>
-      </w:r>
-      <w:r>
         <w:lastRenderedPageBreak/>
         <w:t xml:space="preserve">One can find Hobbesian moments in his </w:t>
       </w:r>
@@ -226,8 +222,6 @@
       </w:pPr>
       <w:r>
         <w:t xml:space="preserve">Moral relations face another, but equally important, challenge: the psychological threat of the mere first-personal moral point of view. The mere first-personal point of view consists of a </w:t>
-      </w:r>
-      <w:r>
         <w:lastRenderedPageBreak/>
         <w:t>moral orientation where an individual only notices or cares about her or his own values and reasons. It is not necessarily egotistical or selfish. One can both care about others and one’s moral commitments. The mere first-personal perspective instead does not recognize other persons as distinct valuers with their own perspectives and reasons. If she does not take others’ perspective seriously, she cannot rationally hold them accountable for actions that they cannot see as wrong.</w:t>
       </w:r>
@@ -285,8 +279,6 @@
       </w:r>
       <w:r>
         <w:t xml:space="preserve">, Gaus argues that impartial Kantian reasoning, such as Rawls’s original position abstraction, cannot, by itself, generate a uniquely justified set of rules </w:t>
-      </w:r>
-      <w:r>
         <w:lastRenderedPageBreak/>
         <w:t>or principles, due to reasonable pluralism. Gaus claims that we should “give up on the hope that we can construct a compelling description of members of the ‘realm of ends’ that will lead them to agree on the same rule.”</w:t>
       </w:r>
@@ -325,8 +317,6 @@
       </w:r>
       <w:r>
         <w:t xml:space="preserve"> The solution to the indeterminacy of Rawlsian political reasoning, then, is to “evaluate our evolved rules from the perspective of </w:t>
-      </w:r>
-      <w:r>
         <w:lastRenderedPageBreak/>
         <w:t>public reason: we must seek to determine whether the outcome of the social evolutionary process is within the optimal eligible set.”</w:t>
       </w:r>
@@ -401,8 +391,6 @@
       </w:pPr>
       <w:r>
         <w:t xml:space="preserve">But social morality, even when sustained by public justification, has limits. Moral evolution through the Kantian Coordination Game is path-dependent: societies can settle on rules that are within the eligible set but far from optimal. Social morality lacks a mechanism for </w:t>
-      </w:r>
-      <w:r>
         <w:lastRenderedPageBreak/>
         <w:t>escaping these suboptimal equilibria on its own. Its rules remain indeterminate at critical points, and when disagreement runs deep, moral persuasion and the reactive attitudes cannot reliably resolve disputes or prevent defection. Social morality is the foundation of cooperative order, but it cannot complete itself. Something more is needed, and that is the state.</w:t>
       </w:r>
@@ -486,7 +474,7 @@
         <w:ind w:firstLine="720"/>
       </w:pPr>
       <w:r>
-        <w:t>But Gaus is no anarchist. He rejects both market anarchism and minimal state libertarianism. A pure capitalist order would allow for no redistribution of wealth, no government production of public goods, or any regulations other than the regulatory effect of torts and contracts. But there are many reasonable people, if not the vast majority of them, who believe, with epistemic justification, that a less-than-minimal state cannot be publicly justified because it would coercively prohibit people from collectively deciding to extend state power. This means that they have respectable objections to the sorts of coercion required to limit the state as much as libertarians would like.</w:t>
+        <w:t>But Gaus is no anarchist. He rejects both market anarchism and minimal state libertarianism. A pure capitalist order would allow for no redistribution of wealth, no government production of public goods, or any regulations other than the regulatory effect of torts and contracts. But there are many reasonable people, if not the vast majority of them, who believe, with epistemic justification, that a minimal state cannot be publicly justified because it would coercively prohibit people from collectively deciding to extend state power. This means that they have respectable objections to the sorts of coercion required to limit the state as much as libertarians would like.</w:t>
       </w:r>
       <w:r>
         <w:rPr>
@@ -520,8 +508,6 @@
       </w:r>
       <w:r>
         <w:t xml:space="preserve"> That is, they will endorse a number of rights by reasoning as bare agents, stripped of some of their individuating characteristics. In doing so, members will adopt a presumption in favor of liberty, respect for autarchy (self-directed action, but not full-blown autonomy), rights </w:t>
-      </w:r>
-      <w:r>
         <w:lastRenderedPageBreak/>
         <w:t>not to be coerced, freedom of thought, rights against harm, and rights to assistance.</w:t>
       </w:r>
@@ -672,8 +658,6 @@
       </w:pPr>
       <w:r>
         <w:t xml:space="preserve">But property rights, however extensive, remain downstream of the abstract agency rights discussed earlier. Because weak duties of assistance survive at the abstract level, property rights cannot be absolute: members of the public who endorse duties of assistance have defeaters for unlimited property claims. This prevents Gaus’s theory from collapsing into libertarianism. The </w:t>
-      </w:r>
-      <w:r>
         <w:lastRenderedPageBreak/>
         <w:t>state’s authority to tax and redistribute, within limits, flows from the priority of agency rights over jurisdictional rights in the order of justification.</w:t>
       </w:r>
@@ -703,8 +687,6 @@
       </w:r>
       <w:r>
         <w:t xml:space="preserve"> A second argument against socialism is empirical </w:t>
-      </w:r>
-      <w:r>
         <w:lastRenderedPageBreak/>
         <w:t>in nature: “extensive private ownership – including capital goods and finance – is for all practical purposes a requisite for a social and political order that protects civil liberties.”</w:t>
       </w:r>
@@ -773,8 +755,6 @@
       </w:r>
       <w:r>
         <w:t xml:space="preserve"> The argument for this position rests on five core claims: (1) individuals are free and equal; (2) free and equal persons have a moral right not to be forced or coerced without justification; (3) a </w:t>
-      </w:r>
-      <w:r>
         <w:lastRenderedPageBreak/>
         <w:t>member of the public will hold that the greater her estimates of coercion, the stronger must be the justification; (4) free and equal members of the public reasonably disagree on many matters involving degrees of coercion, but many reasonable people believe that large states with high rates of taxation and redistributive institutions are more coercive; and (5) only laws that can be justified to all members of the public can reconcile coercion with respect for everyone’s freedom and equality.</w:t>
       </w:r>
@@ -884,108 +864,11 @@
         <w:t>Gaus’s justification for the state flows from this vision. The state is not justified as a Hobbesian escape from the state of nature, nor as a Rawlsian embodiment of principles chosen behind a veil of ignorance. It is justified as an institution that sustains publicly justified moral relations among free and equal persons; its authority is real but circumscribed, always secondary to the social morality it serves, always constrained by the right against legal coercion, and always subject to the test of public justification from the diverse perspectives of all citizens.</w:t>
       </w:r>
     </w:p>
-    <w:p>
-      <w:r>
-        <w:br/>
-      </w:r>
-      <w:r>
-        <w:br w:type="page"/>
-      </w:r>
-    </w:p>
-    <w:p>
-      <w:pPr>
-        <w:spacing w:after="240" w:line="480" w:lineRule="auto"/>
-        <w:jc w:val="center"/>
-      </w:pPr>
-      <w:r>
-        <w:rPr>
-          <w:b/>
-          <w:bCs/>
-        </w:rPr>
-        <w:lastRenderedPageBreak/>
-        <w:t>Abstract</w:t>
-      </w:r>
-    </w:p>
-    <w:p>
-      <w:pPr>
-        <w:spacing w:line="480" w:lineRule="auto"/>
-      </w:pPr>
-      <w:r>
-        <w:t>This essay examines Gerald Gaus’s justification for the state. Gaus’s justification is neither contractarian nor anarchist, but grounded in the requirements of social morality among free and equal persons. The foundations of his theory lie in his account of moral relations and the idea of public justification. Public justification sustains moral relations in the face of deep disagreement. Social morality, however, has limits. Moral evolution is path-dependent, and societies can settle on suboptimal equilibria that social morality cannot escape on its own. The state enters the picture to perform functions that non-coercive social morality cannot. The state has genuine political authority. It may use justified coercion to enforce its laws and create new duties and rights. But each use of coercion must be independently justified, constrained by a right against legal coercion. The result is a “classical tilt” toward limited government. Public reason liberalism permits a range of legitimate state functions. But it tilts against coercive states whose authority exceeds what can be justified to all members of the public.</w:t>
-      </w:r>
-    </w:p>
-    <w:p>
-      <w:r>
-        <w:br/>
-      </w:r>
-      <w:r>
-        <w:br w:type="page"/>
-      </w:r>
-    </w:p>
-    <w:p>
-      <w:pPr>
-        <w:spacing w:after="240" w:line="480" w:lineRule="auto"/>
-        <w:jc w:val="center"/>
-      </w:pPr>
-      <w:r>
-        <w:rPr>
-          <w:b/>
-          <w:bCs/>
-        </w:rPr>
-        <w:lastRenderedPageBreak/>
-        <w:t>Biographical Note</w:t>
-      </w:r>
-    </w:p>
-    <w:p>
-      <w:pPr>
-        <w:spacing w:line="480" w:lineRule="auto"/>
-      </w:pPr>
-      <w:r>
-        <w:t xml:space="preserve">Kevin Vallier is Professor of Philosophy at the University of Toledo. His research focuses on public reason liberalism, social trust, and the relationship between religion and politics. He is the author of </w:t>
-      </w:r>
-      <w:r>
-        <w:rPr>
-          <w:i/>
-          <w:iCs/>
-        </w:rPr>
-        <w:t>Liberal Politics and Public Faith: Beyond Separation</w:t>
-      </w:r>
-      <w:r>
-        <w:t xml:space="preserve"> (Routledge, 2014), </w:t>
-      </w:r>
-      <w:r>
-        <w:rPr>
-          <w:i/>
-          <w:iCs/>
-        </w:rPr>
-        <w:t>Must Politics Be War? Restoring Our Trust in the Open Society</w:t>
-      </w:r>
-      <w:r>
-        <w:t xml:space="preserve"> (Oxford University Press, 2019), </w:t>
-      </w:r>
-      <w:r>
-        <w:rPr>
-          <w:i/>
-          <w:iCs/>
-        </w:rPr>
-        <w:t>Trust in a Polarized Age</w:t>
-      </w:r>
-      <w:r>
-        <w:t xml:space="preserve"> (Oxford University Press, 2020), and </w:t>
-      </w:r>
-      <w:r>
-        <w:rPr>
-          <w:i/>
-          <w:iCs/>
-        </w:rPr>
-        <w:t>All the Kingdoms of the World: On Radical Religious Alternatives to Liberalism</w:t>
-      </w:r>
-      <w:r>
-        <w:t xml:space="preserve"> (Oxford University Press, 2023).</w:t>
-      </w:r>
-    </w:p>
     <w:sectPr>
       <w:headerReference w:type="default" r:id="rId7"/>
+      <w:endnotePr>
+        <w:numFmt w:val="decimal"/>
+      </w:endnotePr>
       <w:pgSz w:w="12240" w:h="15840"/>
       <w:pgMar w:top="1440" w:right="1440" w:bottom="1440" w:left="1440" w:header="708" w:footer="708" w:gutter="0"/>
       <w:cols w:space="720"/>
@@ -1020,6 +903,9 @@
         <w:endnoteRef/>
       </w:r>
       <w:r>
+        <w:t xml:space="preserve"> </w:t>
+      </w:r>
+      <w:r>
         <w:t xml:space="preserve">Gerald Gaus (1952–2020) was the James E. Rogers Professor of Philosophy at the University of Arizona. His five major works are </w:t>
       </w:r>
       <w:r>
@@ -1083,6 +969,9 @@
         <w:endnoteRef/>
       </w:r>
       <w:r>
+        <w:t xml:space="preserve"> </w:t>
+      </w:r>
+      <w:r>
         <w:t xml:space="preserve">Kevin Vallier, ‘The Social Philosophy of Gerald Gaus: Moral Relations Amid Control, Contestation, and Complexity’, </w:t>
       </w:r>
       <w:r>
@@ -1106,6 +995,9 @@
         <w:endnoteRef/>
       </w:r>
       <w:r>
+        <w:t xml:space="preserve"> </w:t>
+      </w:r>
+      <w:r>
         <w:t xml:space="preserve">Gaus, </w:t>
       </w:r>
       <w:r>
@@ -1129,6 +1021,9 @@
         <w:endnoteRef/>
       </w:r>
       <w:r>
+        <w:t xml:space="preserve"> </w:t>
+      </w:r>
+      <w:r>
         <w:t xml:space="preserve">Gaus, </w:t>
       </w:r>
       <w:r>
@@ -1162,6 +1057,9 @@
         <w:endnoteRef/>
       </w:r>
       <w:r>
+        <w:t xml:space="preserve"> </w:t>
+      </w:r>
+      <w:r>
         <w:t xml:space="preserve">P. F. Strawson, ‘Freedom and Resentment’, in </w:t>
       </w:r>
       <w:r>
@@ -1185,6 +1083,9 @@
         <w:endnoteRef/>
       </w:r>
       <w:r>
+        <w:t xml:space="preserve"> </w:t>
+      </w:r>
+      <w:r>
         <w:t xml:space="preserve">Gaus, </w:t>
       </w:r>
       <w:r>
@@ -1208,6 +1109,9 @@
         <w:endnoteRef/>
       </w:r>
       <w:r>
+        <w:t xml:space="preserve"> </w:t>
+      </w:r>
+      <w:r>
         <w:t xml:space="preserve">Gaus, </w:t>
       </w:r>
       <w:r>
@@ -1231,6 +1135,9 @@
         <w:endnoteRef/>
       </w:r>
       <w:r>
+        <w:t xml:space="preserve"> </w:t>
+      </w:r>
+      <w:r>
         <w:t xml:space="preserve">Gaus, </w:t>
       </w:r>
       <w:r>
@@ -1254,6 +1161,9 @@
         <w:endnoteRef/>
       </w:r>
       <w:r>
+        <w:t xml:space="preserve"> </w:t>
+      </w:r>
+      <w:r>
         <w:t xml:space="preserve">Gaus, </w:t>
       </w:r>
       <w:r>
@@ -1277,6 +1187,9 @@
         <w:endnoteRef/>
       </w:r>
       <w:r>
+        <w:t xml:space="preserve"> </w:t>
+      </w:r>
+      <w:r>
         <w:t xml:space="preserve">Gaus, </w:t>
       </w:r>
       <w:r>
@@ -1300,6 +1213,9 @@
         <w:endnoteRef/>
       </w:r>
       <w:r>
+        <w:t xml:space="preserve"> </w:t>
+      </w:r>
+      <w:r>
         <w:t xml:space="preserve">Gaus, </w:t>
       </w:r>
       <w:r>
@@ -1323,6 +1239,9 @@
         <w:endnoteRef/>
       </w:r>
       <w:r>
+        <w:t xml:space="preserve"> </w:t>
+      </w:r>
+      <w:r>
         <w:t xml:space="preserve">Gaus, </w:t>
       </w:r>
       <w:r>
@@ -1346,6 +1265,9 @@
         <w:endnoteRef/>
       </w:r>
       <w:r>
+        <w:t xml:space="preserve"> </w:t>
+      </w:r>
+      <w:r>
         <w:t xml:space="preserve">Gaus, </w:t>
       </w:r>
       <w:r>
@@ -1369,6 +1291,9 @@
         <w:endnoteRef/>
       </w:r>
       <w:r>
+        <w:t xml:space="preserve"> </w:t>
+      </w:r>
+      <w:r>
         <w:t xml:space="preserve">Gaus, </w:t>
       </w:r>
       <w:r>
@@ -1392,6 +1317,9 @@
         <w:endnoteRef/>
       </w:r>
       <w:r>
+        <w:t xml:space="preserve"> </w:t>
+      </w:r>
+      <w:r>
         <w:t xml:space="preserve">Gaus, </w:t>
       </w:r>
       <w:r>
@@ -1425,6 +1353,9 @@
         <w:endnoteRef/>
       </w:r>
       <w:r>
+        <w:t xml:space="preserve"> </w:t>
+      </w:r>
+      <w:r>
         <w:t xml:space="preserve">Gaus, </w:t>
       </w:r>
       <w:r>
@@ -1448,6 +1379,9 @@
         <w:endnoteRef/>
       </w:r>
       <w:r>
+        <w:t xml:space="preserve"> </w:t>
+      </w:r>
+      <w:r>
         <w:t xml:space="preserve">Gaus, </w:t>
       </w:r>
       <w:r>
@@ -1471,6 +1405,9 @@
         <w:endnoteRef/>
       </w:r>
       <w:r>
+        <w:t xml:space="preserve"> </w:t>
+      </w:r>
+      <w:r>
         <w:t xml:space="preserve">Gaus, </w:t>
       </w:r>
       <w:r>
@@ -1494,6 +1431,9 @@
         <w:endnoteRef/>
       </w:r>
       <w:r>
+        <w:t xml:space="preserve"> </w:t>
+      </w:r>
+      <w:r>
         <w:t xml:space="preserve">Gaus, </w:t>
       </w:r>
       <w:r>
@@ -1517,6 +1457,9 @@
         <w:endnoteRef/>
       </w:r>
       <w:r>
+        <w:t xml:space="preserve"> </w:t>
+      </w:r>
+      <w:r>
         <w:t xml:space="preserve">Gaus, </w:t>
       </w:r>
       <w:r>
@@ -1540,6 +1483,9 @@
         <w:endnoteRef/>
       </w:r>
       <w:r>
+        <w:t xml:space="preserve"> </w:t>
+      </w:r>
+      <w:r>
         <w:t xml:space="preserve">Gaus, </w:t>
       </w:r>
       <w:r>
@@ -1563,6 +1509,9 @@
         <w:endnoteRef/>
       </w:r>
       <w:r>
+        <w:t xml:space="preserve"> </w:t>
+      </w:r>
+      <w:r>
         <w:t xml:space="preserve">Gaus, </w:t>
       </w:r>
       <w:r>
@@ -1586,6 +1535,9 @@
         <w:endnoteRef/>
       </w:r>
       <w:r>
+        <w:t xml:space="preserve"> </w:t>
+      </w:r>
+      <w:r>
         <w:t xml:space="preserve">Gaus, </w:t>
       </w:r>
       <w:r>
@@ -1609,6 +1561,9 @@
         <w:endnoteRef/>
       </w:r>
       <w:r>
+        <w:t xml:space="preserve"> </w:t>
+      </w:r>
+      <w:r>
         <w:t xml:space="preserve">Gaus, </w:t>
       </w:r>
       <w:r>
@@ -1632,6 +1587,9 @@
         <w:endnoteRef/>
       </w:r>
       <w:r>
+        <w:t xml:space="preserve"> </w:t>
+      </w:r>
+      <w:r>
         <w:t xml:space="preserve">Gaus, </w:t>
       </w:r>
       <w:r>
@@ -1655,6 +1613,9 @@
         <w:endnoteRef/>
       </w:r>
       <w:r>
+        <w:t xml:space="preserve"> </w:t>
+      </w:r>
+      <w:r>
         <w:t xml:space="preserve">Gaus, </w:t>
       </w:r>
       <w:r>
@@ -1678,6 +1639,9 @@
         <w:endnoteRef/>
       </w:r>
       <w:r>
+        <w:t xml:space="preserve"> </w:t>
+      </w:r>
+      <w:r>
         <w:t xml:space="preserve">Gaus, </w:t>
       </w:r>
       <w:r>
@@ -1701,6 +1665,9 @@
         <w:endnoteRef/>
       </w:r>
       <w:r>
+        <w:t xml:space="preserve"> </w:t>
+      </w:r>
+      <w:r>
         <w:t xml:space="preserve">Gaus, </w:t>
       </w:r>
       <w:r>
@@ -1724,6 +1691,9 @@
         <w:endnoteRef/>
       </w:r>
       <w:r>
+        <w:t xml:space="preserve"> </w:t>
+      </w:r>
+      <w:r>
         <w:t xml:space="preserve">Gaus, </w:t>
       </w:r>
       <w:r>
@@ -1747,6 +1717,9 @@
         <w:endnoteRef/>
       </w:r>
       <w:r>
+        <w:t xml:space="preserve"> </w:t>
+      </w:r>
+      <w:r>
         <w:t xml:space="preserve">Gaus, </w:t>
       </w:r>
       <w:r>
@@ -1770,6 +1743,9 @@
         <w:endnoteRef/>
       </w:r>
       <w:r>
+        <w:t xml:space="preserve"> </w:t>
+      </w:r>
+      <w:r>
         <w:t xml:space="preserve">Gaus, </w:t>
       </w:r>
       <w:r>
@@ -1793,6 +1769,9 @@
         <w:endnoteRef/>
       </w:r>
       <w:r>
+        <w:t xml:space="preserve"> </w:t>
+      </w:r>
+      <w:r>
         <w:t xml:space="preserve">Knut Wicksell, ‘A New Principle of Just Taxation’, in </w:t>
       </w:r>
       <w:r>
@@ -1826,6 +1805,9 @@
         <w:endnoteRef/>
       </w:r>
       <w:r>
+        <w:t xml:space="preserve"> </w:t>
+      </w:r>
+      <w:r>
         <w:t xml:space="preserve">Gaus, </w:t>
       </w:r>
       <w:r>
@@ -1849,6 +1831,9 @@
         <w:endnoteRef/>
       </w:r>
       <w:r>
+        <w:t xml:space="preserve"> </w:t>
+      </w:r>
+      <w:r>
         <w:t>Vallier, ‘The Social Philosophy of Gerald Gaus’, p. 524.</w:t>
       </w:r>
     </w:p>
@@ -1862,6 +1847,9 @@
         <w:endnoteRef/>
       </w:r>
       <w:r>
+        <w:t xml:space="preserve"> </w:t>
+      </w:r>
+      <w:r>
         <w:t xml:space="preserve">Gaus, </w:t>
       </w:r>
       <w:r>
@@ -1883,6 +1871,9 @@
           <w:rStyle w:val="EndnoteReference"/>
         </w:rPr>
         <w:endnoteRef/>
+      </w:r>
+      <w:r>
+        <w:t xml:space="preserve"> </w:t>
       </w:r>
       <w:r>
         <w:t>Vallier, ‘The Social Philosophy of Gerald Gaus’, pp. 524–26.</w:t>

</xml_diff>